<commit_message>
aula 5 - probabilidade exercicios
</commit_message>
<xml_diff>
--- a/docs/antigas/Lista04-2026.docx
+++ b/docs/antigas/Lista04-2026.docx
@@ -825,6 +825,7 @@
                                 <w:sz w:val="44"/>
                               </w:rPr>
                             </w:pPr>
+                            <w:proofErr w:type="spellStart"/>
                             <w:r>
                               <w:rPr>
                                 <w:rFonts w:ascii="Arial" w:hAnsi="Arial" w:cs="Arial"/>
@@ -834,6 +835,7 @@
                               </w:rPr>
                               <w:t>unesp</w:t>
                             </w:r>
+                            <w:proofErr w:type="spellEnd"/>
                           </w:p>
                         </w:txbxContent>
                       </wps:txbx>
@@ -933,47 +935,40 @@
       <w:pPr>
         <w:pStyle w:val="PosGrad"/>
         <w:rPr>
-          <w:sz w:val="20"/>
-          <w:szCs w:val="20"/>
+          <w:sz w:val="18"/>
+          <w:szCs w:val="18"/>
         </w:rPr>
       </w:pPr>
       <w:r>
         <w:rPr>
           <w:b w:val="0"/>
-          <w:sz w:val="20"/>
-          <w:szCs w:val="20"/>
-        </w:rPr>
-        <w:t>1</w:t>
+          <w:sz w:val="18"/>
+          <w:szCs w:val="18"/>
+        </w:rPr>
+        <w:t>1)</w:t>
+      </w:r>
+      <w:r>
+        <w:rPr>
+          <w:sz w:val="18"/>
+          <w:szCs w:val="18"/>
+        </w:rPr>
+        <w:t xml:space="preserve"> </w:t>
       </w:r>
       <w:r>
         <w:rPr>
           <w:b w:val="0"/>
-          <w:sz w:val="20"/>
-          <w:szCs w:val="20"/>
-        </w:rPr>
-        <w:t>)</w:t>
-      </w:r>
-      <w:r>
-        <w:rPr>
-          <w:sz w:val="20"/>
-          <w:szCs w:val="20"/>
-        </w:rPr>
-        <w:t xml:space="preserve"> </w:t>
-      </w:r>
-      <w:r>
-        <w:rPr>
-          <w:b w:val="0"/>
-          <w:sz w:val="20"/>
-          <w:szCs w:val="20"/>
+          <w:sz w:val="18"/>
+          <w:szCs w:val="18"/>
         </w:rPr>
         <w:t>Dadas as letras {a, b, c, d, e, f, g, h}, calcule o número de maneiras que podemos dispor essas letras, ou seja, a Permutação (</w:t>
       </w:r>
+      <w:proofErr w:type="spellStart"/>
       <w:r>
         <w:rPr>
           <w:b w:val="0"/>
           <w:i/>
-          <w:sz w:val="20"/>
-          <w:szCs w:val="20"/>
+          <w:sz w:val="18"/>
+          <w:szCs w:val="18"/>
           <w:vertAlign w:val="subscript"/>
         </w:rPr>
         <w:t>n</w:t>
@@ -982,8 +977,8 @@
         <w:rPr>
           <w:b w:val="0"/>
           <w:i/>
-          <w:sz w:val="20"/>
-          <w:szCs w:val="20"/>
+          <w:sz w:val="18"/>
+          <w:szCs w:val="18"/>
         </w:rPr>
         <w:t>P</w:t>
       </w:r>
@@ -991,17 +986,18 @@
         <w:rPr>
           <w:b w:val="0"/>
           <w:i/>
-          <w:sz w:val="20"/>
-          <w:szCs w:val="20"/>
+          <w:sz w:val="18"/>
+          <w:szCs w:val="18"/>
           <w:vertAlign w:val="subscript"/>
         </w:rPr>
         <w:t>n</w:t>
       </w:r>
+      <w:proofErr w:type="spellEnd"/>
       <w:r>
         <w:rPr>
           <w:b w:val="0"/>
-          <w:sz w:val="20"/>
-          <w:szCs w:val="20"/>
+          <w:sz w:val="18"/>
+          <w:szCs w:val="18"/>
         </w:rPr>
         <w:t xml:space="preserve">). </w:t>
       </w:r>
@@ -1010,14 +1006,14 @@
       <w:pPr>
         <w:pStyle w:val="PosGrad"/>
         <w:rPr>
-          <w:sz w:val="20"/>
-          <w:szCs w:val="20"/>
-        </w:rPr>
-      </w:pPr>
-      <w:r>
-        <w:rPr>
-          <w:sz w:val="20"/>
-          <w:szCs w:val="20"/>
+          <w:sz w:val="18"/>
+          <w:szCs w:val="18"/>
+        </w:rPr>
+      </w:pPr>
+      <w:r>
+        <w:rPr>
+          <w:sz w:val="18"/>
+          <w:szCs w:val="18"/>
         </w:rPr>
         <w:tab/>
       </w:r>
@@ -1026,47 +1022,40 @@
       <w:pPr>
         <w:pStyle w:val="PosGrad"/>
         <w:rPr>
-          <w:sz w:val="20"/>
-          <w:szCs w:val="20"/>
+          <w:sz w:val="18"/>
+          <w:szCs w:val="18"/>
         </w:rPr>
       </w:pPr>
       <w:r>
         <w:rPr>
           <w:b w:val="0"/>
-          <w:sz w:val="20"/>
-          <w:szCs w:val="20"/>
-        </w:rPr>
-        <w:t>2</w:t>
+          <w:sz w:val="18"/>
+          <w:szCs w:val="18"/>
+        </w:rPr>
+        <w:t>2)</w:t>
+      </w:r>
+      <w:r>
+        <w:rPr>
+          <w:sz w:val="18"/>
+          <w:szCs w:val="18"/>
+        </w:rPr>
+        <w:t xml:space="preserve"> </w:t>
       </w:r>
       <w:r>
         <w:rPr>
           <w:b w:val="0"/>
-          <w:sz w:val="20"/>
-          <w:szCs w:val="20"/>
-        </w:rPr>
-        <w:t>)</w:t>
-      </w:r>
-      <w:r>
-        <w:rPr>
-          <w:sz w:val="20"/>
-          <w:szCs w:val="20"/>
-        </w:rPr>
-        <w:t xml:space="preserve"> </w:t>
-      </w:r>
-      <w:r>
-        <w:rPr>
-          <w:b w:val="0"/>
-          <w:sz w:val="20"/>
-          <w:szCs w:val="20"/>
+          <w:sz w:val="18"/>
+          <w:szCs w:val="18"/>
         </w:rPr>
         <w:t>Dadas as mesmas letras do exercício anterior, se retirarmos uma amostra de tamanho igual a 6, calcule o número de maneiras que podemos dispor os 6 elementos retirados, ou seja, o Arranjo simples (</w:t>
       </w:r>
+      <w:proofErr w:type="spellStart"/>
       <w:r>
         <w:rPr>
           <w:b w:val="0"/>
           <w:i/>
-          <w:sz w:val="20"/>
-          <w:szCs w:val="20"/>
+          <w:sz w:val="18"/>
+          <w:szCs w:val="18"/>
           <w:vertAlign w:val="subscript"/>
         </w:rPr>
         <w:t>n</w:t>
@@ -1075,8 +1064,8 @@
         <w:rPr>
           <w:b w:val="0"/>
           <w:i/>
-          <w:sz w:val="20"/>
-          <w:szCs w:val="20"/>
+          <w:sz w:val="18"/>
+          <w:szCs w:val="18"/>
         </w:rPr>
         <w:t>P</w:t>
       </w:r>
@@ -1084,24 +1073,25 @@
         <w:rPr>
           <w:b w:val="0"/>
           <w:i/>
-          <w:sz w:val="20"/>
-          <w:szCs w:val="20"/>
+          <w:sz w:val="18"/>
+          <w:szCs w:val="18"/>
           <w:vertAlign w:val="subscript"/>
         </w:rPr>
         <w:t>r</w:t>
       </w:r>
+      <w:proofErr w:type="spellEnd"/>
       <w:r>
         <w:rPr>
           <w:b w:val="0"/>
-          <w:sz w:val="20"/>
-          <w:szCs w:val="20"/>
+          <w:sz w:val="18"/>
+          <w:szCs w:val="18"/>
         </w:rPr>
         <w:t>).</w:t>
       </w:r>
       <w:r>
         <w:rPr>
-          <w:sz w:val="20"/>
-          <w:szCs w:val="20"/>
+          <w:sz w:val="18"/>
+          <w:szCs w:val="18"/>
         </w:rPr>
         <w:t xml:space="preserve">  </w:t>
       </w:r>
@@ -1110,8 +1100,8 @@
       <w:pPr>
         <w:pStyle w:val="PosGrad"/>
         <w:rPr>
-          <w:sz w:val="20"/>
-          <w:szCs w:val="20"/>
+          <w:sz w:val="18"/>
+          <w:szCs w:val="18"/>
         </w:rPr>
       </w:pPr>
     </w:p>
@@ -1119,48 +1109,33 @@
       <w:pPr>
         <w:pStyle w:val="PosGrad"/>
         <w:rPr>
-          <w:sz w:val="20"/>
-          <w:szCs w:val="20"/>
+          <w:sz w:val="18"/>
+          <w:szCs w:val="18"/>
         </w:rPr>
       </w:pPr>
       <w:r>
         <w:rPr>
           <w:b w:val="0"/>
-          <w:sz w:val="20"/>
-          <w:szCs w:val="20"/>
+          <w:sz w:val="18"/>
+          <w:szCs w:val="18"/>
         </w:rPr>
         <w:t>3</w:t>
       </w:r>
       <w:r>
         <w:rPr>
           <w:b w:val="0"/>
-          <w:sz w:val="20"/>
-          <w:szCs w:val="20"/>
-        </w:rPr>
-        <w:t>) Dadas as mesmas letras do</w:t>
-      </w:r>
-      <w:r>
-        <w:rPr>
-          <w:b w:val="0"/>
-          <w:sz w:val="20"/>
-          <w:szCs w:val="20"/>
-        </w:rPr>
-        <w:t>s exercícios anteriores</w:t>
-      </w:r>
-      <w:r>
-        <w:rPr>
-          <w:b w:val="0"/>
-          <w:sz w:val="20"/>
-          <w:szCs w:val="20"/>
-        </w:rPr>
-        <w:t>, se retirarmos uma amostra de tamanho igual a 6, calcule o número de maneiras, sem considerar a ordem, que podemos combinar os 6 elementos retirados, ou seja, a Combinação (</w:t>
-      </w:r>
+          <w:sz w:val="18"/>
+          <w:szCs w:val="18"/>
+        </w:rPr>
+        <w:t>) Dadas as mesmas letras dos exercícios anteriores, se retirarmos uma amostra de tamanho igual a 6, calcule o número de maneiras, sem considerar a ordem, que podemos combinar os 6 elementos retirados, ou seja, a Combinação (</w:t>
+      </w:r>
+      <w:proofErr w:type="spellStart"/>
       <w:r>
         <w:rPr>
           <w:b w:val="0"/>
           <w:i/>
-          <w:sz w:val="20"/>
-          <w:szCs w:val="20"/>
+          <w:sz w:val="18"/>
+          <w:szCs w:val="18"/>
           <w:vertAlign w:val="subscript"/>
         </w:rPr>
         <w:t>n</w:t>
@@ -1169,8 +1144,8 @@
         <w:rPr>
           <w:b w:val="0"/>
           <w:i/>
-          <w:sz w:val="20"/>
-          <w:szCs w:val="20"/>
+          <w:sz w:val="18"/>
+          <w:szCs w:val="18"/>
         </w:rPr>
         <w:t>C</w:t>
       </w:r>
@@ -1178,17 +1153,18 @@
         <w:rPr>
           <w:b w:val="0"/>
           <w:i/>
-          <w:sz w:val="20"/>
-          <w:szCs w:val="20"/>
+          <w:sz w:val="18"/>
+          <w:szCs w:val="18"/>
           <w:vertAlign w:val="subscript"/>
         </w:rPr>
         <w:t>r</w:t>
       </w:r>
+      <w:proofErr w:type="spellEnd"/>
       <w:r>
         <w:rPr>
           <w:b w:val="0"/>
-          <w:sz w:val="20"/>
-          <w:szCs w:val="20"/>
+          <w:sz w:val="18"/>
+          <w:szCs w:val="18"/>
         </w:rPr>
         <w:t xml:space="preserve">): </w:t>
       </w:r>
@@ -1198,63 +1174,75 @@
         <w:jc w:val="both"/>
         <w:rPr>
           <w:rFonts w:ascii="Book Antiqua" w:hAnsi="Book Antiqua"/>
-        </w:rPr>
-      </w:pPr>
-    </w:p>
-    <w:p>
-      <w:pPr>
-        <w:jc w:val="both"/>
-      </w:pPr>
-      <w:r>
-        <w:rPr>
-          <w:rFonts w:ascii="Book Antiqua" w:hAnsi="Book Antiqua"/>
+          <w:sz w:val="18"/>
+          <w:szCs w:val="18"/>
+        </w:rPr>
+      </w:pPr>
+    </w:p>
+    <w:p>
+      <w:pPr>
+        <w:jc w:val="both"/>
+        <w:rPr>
+          <w:sz w:val="18"/>
+          <w:szCs w:val="18"/>
+        </w:rPr>
+      </w:pPr>
+      <w:r>
+        <w:rPr>
+          <w:rFonts w:ascii="Book Antiqua" w:hAnsi="Book Antiqua"/>
+          <w:sz w:val="18"/>
+          <w:szCs w:val="18"/>
         </w:rPr>
         <w:t>4</w:t>
       </w:r>
       <w:r>
         <w:rPr>
           <w:rFonts w:ascii="Book Antiqua" w:hAnsi="Book Antiqua"/>
-        </w:rPr>
-        <w:t xml:space="preserve"> Uma usina de açúcar e álcool deve realizar a operação de colheita em 3 fazendas diferentes. Na primeira fazenda, existem 5 talhões, na segunda fazenda, existem 4 talhões e na terceira fazenda, existem 6 talhões. No primeiro dia de trabalho, serão colhidos 3 talhões, ou seja, 1 talhão em cada fazenda. De quantas maneiras diferentes poderá ser realizada essa operação no primeiro dia de trabalho? Se no primeiro dia de trabalho fosse possível</w:t>
-      </w:r>
-      <w:r>
-        <w:rPr>
-          <w:rFonts w:ascii="Book Antiqua" w:hAnsi="Book Antiqua"/>
-        </w:rPr>
-        <w:t xml:space="preserve"> colher</w:t>
-      </w:r>
-      <w:r>
-        <w:rPr>
-          <w:rFonts w:ascii="Book Antiqua" w:hAnsi="Book Antiqua"/>
-        </w:rPr>
-        <w:t xml:space="preserve"> 2 talhões de cada fazenda, de quantas maneiras diferentes essa operação poderá ser realizada?</w:t>
-      </w:r>
-    </w:p>
-    <w:p>
-      <w:pPr>
-        <w:jc w:val="both"/>
-        <w:rPr>
-          <w:rFonts w:ascii="Book Antiqua" w:hAnsi="Book Antiqua"/>
-        </w:rPr>
-      </w:pPr>
-    </w:p>
-    <w:p>
-      <w:pPr>
-        <w:jc w:val="both"/>
-      </w:pPr>
-      <w:r>
-        <w:rPr>
-          <w:rFonts w:ascii="Book Antiqua" w:hAnsi="Book Antiqua"/>
+          <w:sz w:val="18"/>
+          <w:szCs w:val="18"/>
+        </w:rPr>
+        <w:t xml:space="preserve"> Uma usina de açúcar e álcool deve realizar a operação de colheita em 3 fazendas diferentes. Na primeira fazenda, existem 5 talhões, na segunda fazenda, existem 4 talhões e na terceira fazenda, existem 6 talhões. No primeiro dia de trabalho, serão colhidos 3 talhões, ou seja, 1 talhão em cada fazenda. De quantas maneiras diferentes poderá ser realizada essa operação no primeiro dia de trabalho? Se no primeiro dia de trabalho fosse possível colher 2 talhões de cada fazenda, de quantas maneiras diferentes essa operação poderá ser realizada?</w:t>
+      </w:r>
+    </w:p>
+    <w:p>
+      <w:pPr>
+        <w:jc w:val="both"/>
+        <w:rPr>
+          <w:rFonts w:ascii="Book Antiqua" w:hAnsi="Book Antiqua"/>
+          <w:sz w:val="18"/>
+          <w:szCs w:val="18"/>
+        </w:rPr>
+      </w:pPr>
+    </w:p>
+    <w:p>
+      <w:pPr>
+        <w:jc w:val="both"/>
+        <w:rPr>
+          <w:sz w:val="18"/>
+          <w:szCs w:val="18"/>
+        </w:rPr>
+      </w:pPr>
+      <w:r>
+        <w:rPr>
+          <w:rFonts w:ascii="Book Antiqua" w:hAnsi="Book Antiqua"/>
+          <w:sz w:val="18"/>
+          <w:szCs w:val="18"/>
         </w:rPr>
         <w:t>5</w:t>
       </w:r>
       <w:r>
         <w:rPr>
           <w:rFonts w:ascii="Book Antiqua" w:hAnsi="Book Antiqua"/>
+          <w:sz w:val="18"/>
+          <w:szCs w:val="18"/>
         </w:rPr>
         <w:t>) Durante um dia de busca de alimentos, um pássaro visita, sem repetições, 6 diferentes árvores frutíferas. Para evitar um comportamento sistemático, o que deixaria esse indivíduo vulnerável à ação predatória, o pássaro varia a ordenação de suas visitas em cada árvore. De quantas maneiras a procura de alimento pode ser realizada, levando-se em consideração que o pássaro deverá passar por todas as árvores, ou seja, somente uma vez em cada árvore?</w:t>
       </w:r>
       <w:r>
+        <w:rPr>
+          <w:sz w:val="18"/>
+          <w:szCs w:val="18"/>
+        </w:rPr>
         <w:tab/>
       </w:r>
     </w:p>
@@ -1263,6 +1251,8 @@
         <w:jc w:val="both"/>
         <w:rPr>
           <w:rFonts w:ascii="Book Antiqua" w:hAnsi="Book Antiqua"/>
+          <w:sz w:val="18"/>
+          <w:szCs w:val="18"/>
         </w:rPr>
       </w:pPr>
     </w:p>
@@ -1272,11 +1262,15 @@
         <w:jc w:val="both"/>
         <w:rPr>
           <w:rFonts w:ascii="Book Antiqua" w:hAnsi="Book Antiqua"/>
-        </w:rPr>
-      </w:pPr>
-      <w:r>
-        <w:rPr>
-          <w:rFonts w:ascii="Book Antiqua" w:hAnsi="Book Antiqua"/>
+          <w:sz w:val="18"/>
+          <w:szCs w:val="18"/>
+        </w:rPr>
+      </w:pPr>
+      <w:r>
+        <w:rPr>
+          <w:rFonts w:ascii="Book Antiqua" w:hAnsi="Book Antiqua"/>
+          <w:sz w:val="18"/>
+          <w:szCs w:val="18"/>
         </w:rPr>
         <w:t>7) Um mecanismo complexo pode falhar em 15 estágios. De quantas maneiras poderá ocorrer que ele falhe em 3 estágios? (a ordem com que os erros ocorrem é irrelevante).</w:t>
       </w:r>
@@ -1287,6 +1281,8 @@
         <w:jc w:val="both"/>
         <w:rPr>
           <w:rFonts w:ascii="Book Antiqua" w:hAnsi="Book Antiqua"/>
+          <w:sz w:val="18"/>
+          <w:szCs w:val="18"/>
         </w:rPr>
       </w:pPr>
     </w:p>
@@ -1296,41 +1292,73 @@
         <w:jc w:val="both"/>
         <w:rPr>
           <w:rFonts w:ascii="Book Antiqua" w:hAnsi="Book Antiqua"/>
-        </w:rPr>
-      </w:pPr>
-      <w:r>
-        <w:rPr>
-          <w:rFonts w:ascii="Book Antiqua" w:hAnsi="Book Antiqua"/>
+          <w:sz w:val="18"/>
+          <w:szCs w:val="18"/>
+        </w:rPr>
+      </w:pPr>
+      <w:r>
+        <w:rPr>
+          <w:rFonts w:ascii="Book Antiqua" w:hAnsi="Book Antiqua"/>
+          <w:sz w:val="18"/>
+          <w:szCs w:val="18"/>
         </w:rPr>
         <w:t>8</w:t>
       </w:r>
       <w:r>
         <w:rPr>
           <w:rFonts w:ascii="Book Antiqua" w:hAnsi="Book Antiqua"/>
+          <w:sz w:val="18"/>
+          <w:szCs w:val="18"/>
         </w:rPr>
         <w:t xml:space="preserve">) </w:t>
       </w:r>
       <w:r>
         <w:rPr>
           <w:rFonts w:ascii="Book Antiqua" w:hAnsi="Book Antiqua"/>
+          <w:sz w:val="18"/>
+          <w:szCs w:val="18"/>
         </w:rPr>
         <w:tab/>
       </w:r>
       <w:r>
         <w:rPr>
           <w:rFonts w:ascii="Book Antiqua" w:hAnsi="Book Antiqua"/>
-        </w:rPr>
-        <w:t>Utilize o diagrama de Venn para provar as propriedade</w:t>
-      </w:r>
-      <w:r>
-        <w:rPr>
-          <w:rFonts w:ascii="Book Antiqua" w:hAnsi="Book Antiqua"/>
+          <w:sz w:val="18"/>
+          <w:szCs w:val="18"/>
+        </w:rPr>
+        <w:t xml:space="preserve">Utilize o diagrama de </w:t>
+      </w:r>
+      <w:proofErr w:type="spellStart"/>
+      <w:r>
+        <w:rPr>
+          <w:rFonts w:ascii="Book Antiqua" w:hAnsi="Book Antiqua"/>
+          <w:sz w:val="18"/>
+          <w:szCs w:val="18"/>
+        </w:rPr>
+        <w:t>Venn</w:t>
+      </w:r>
+      <w:proofErr w:type="spellEnd"/>
+      <w:r>
+        <w:rPr>
+          <w:rFonts w:ascii="Book Antiqua" w:hAnsi="Book Antiqua"/>
+          <w:sz w:val="18"/>
+          <w:szCs w:val="18"/>
+        </w:rPr>
+        <w:t xml:space="preserve"> para provar as propriedade</w:t>
+      </w:r>
+      <w:r>
+        <w:rPr>
+          <w:rFonts w:ascii="Book Antiqua" w:hAnsi="Book Antiqua"/>
+          <w:sz w:val="18"/>
+          <w:szCs w:val="18"/>
         </w:rPr>
         <w:t>s</w:t>
       </w:r>
       <w:r>
         <w:rPr>
           <w:rFonts w:ascii="Book Antiqua" w:hAnsi="Book Antiqua"/>
+          <w:sz w:val="18"/>
+          <w:szCs w:val="18"/>
         </w:rPr>
         <w:t>:</w:t>
       </w:r>
@@ -1341,16 +1369,16 @@
         <w:jc w:val="both"/>
         <w:rPr>
           <w:rFonts w:ascii="Book Antiqua" w:hAnsi="Book Antiqua"/>
-          <w:sz w:val="24"/>
-          <w:szCs w:val="24"/>
+          <w:sz w:val="18"/>
+          <w:szCs w:val="18"/>
         </w:rPr>
       </w:pPr>
       <w:r>
         <w:rPr>
           <w:rFonts w:ascii="Book Antiqua" w:hAnsi="Book Antiqua"/>
           <w:noProof/>
-          <w:sz w:val="24"/>
-          <w:szCs w:val="24"/>
+          <w:sz w:val="18"/>
+          <w:szCs w:val="18"/>
         </w:rPr>
         <w:object w:dxaOrig="1440" w:dyaOrig="1440" w14:anchorId="0D32C616">
           <v:shapetype id="_x0000_t75" coordsize="21600,21600" o:spt="75" o:preferrelative="t" path="m@4@5l@4@11@9@11@9@5xe" filled="f" stroked="f">
@@ -1375,35 +1403,35 @@
           <v:shape id="Objeto 11" o:spid="_x0000_s1088" type="#_x0000_t75" style="position:absolute;left:0;text-align:left;margin-left:303.2pt;margin-top:6.3pt;width:124pt;height:16pt;z-index:251653632;visibility:visible" o:gfxdata="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">
             <v:imagedata r:id="rId5" o:title=""/>
           </v:shape>
-          <o:OLEObject Type="Embed" ProgID="Equation.3" ShapeID="Objeto 11" DrawAspect="Content" ObjectID="_1835725364" r:id="rId6"/>
+          <o:OLEObject Type="Embed" ProgID="Equation.3" ShapeID="Objeto 11" DrawAspect="Content" ObjectID="_1835931386" r:id="rId6"/>
         </w:object>
       </w:r>
       <w:r>
         <w:rPr>
           <w:rFonts w:ascii="Book Antiqua" w:hAnsi="Book Antiqua"/>
           <w:noProof/>
-          <w:sz w:val="24"/>
-          <w:szCs w:val="24"/>
+          <w:sz w:val="18"/>
+          <w:szCs w:val="18"/>
         </w:rPr>
         <w:object w:dxaOrig="1440" w:dyaOrig="1440" w14:anchorId="6FE5E333">
           <v:shape id="Objeto 9" o:spid="_x0000_s1087" type="#_x0000_t75" style="position:absolute;left:0;text-align:left;margin-left:166.5pt;margin-top:6.3pt;width:93pt;height:19pt;z-index:251652608;visibility:visible" o:gfxdata="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">
             <v:imagedata r:id="rId7" o:title=""/>
           </v:shape>
-          <o:OLEObject Type="Embed" ProgID="Equation.3" ShapeID="Objeto 9" DrawAspect="Content" ObjectID="_1835725365" r:id="rId8"/>
+          <o:OLEObject Type="Embed" ProgID="Equation.3" ShapeID="Objeto 9" DrawAspect="Content" ObjectID="_1835931387" r:id="rId8"/>
         </w:object>
       </w:r>
       <w:r>
         <w:rPr>
           <w:rFonts w:ascii="Book Antiqua" w:hAnsi="Book Antiqua"/>
           <w:noProof/>
-          <w:sz w:val="24"/>
-          <w:szCs w:val="24"/>
+          <w:sz w:val="18"/>
+          <w:szCs w:val="18"/>
         </w:rPr>
         <w:object w:dxaOrig="1440" w:dyaOrig="1440" w14:anchorId="614A17FB">
           <v:shape id="Objeto 6" o:spid="_x0000_s1086" type="#_x0000_t75" style="position:absolute;left:0;text-align:left;margin-left:21.95pt;margin-top:2.75pt;width:93pt;height:19pt;z-index:251651584;visibility:visible" o:gfxdata="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">
             <v:imagedata r:id="rId9" o:title=""/>
           </v:shape>
-          <o:OLEObject Type="Embed" ProgID="Equation.3" ShapeID="Objeto 6" DrawAspect="Content" ObjectID="_1835725366" r:id="rId10"/>
+          <o:OLEObject Type="Embed" ProgID="Equation.3" ShapeID="Objeto 6" DrawAspect="Content" ObjectID="_1835931388" r:id="rId10"/>
         </w:object>
       </w:r>
     </w:p>
@@ -1413,50 +1441,50 @@
         <w:jc w:val="both"/>
         <w:rPr>
           <w:rFonts w:ascii="Book Antiqua" w:hAnsi="Book Antiqua"/>
-          <w:sz w:val="24"/>
-          <w:szCs w:val="24"/>
+          <w:sz w:val="18"/>
+          <w:szCs w:val="18"/>
         </w:rPr>
       </w:pPr>
       <w:r>
         <w:rPr>
           <w:rFonts w:ascii="Book Antiqua" w:hAnsi="Book Antiqua"/>
           <w:noProof/>
-          <w:sz w:val="24"/>
-          <w:szCs w:val="24"/>
+          <w:sz w:val="18"/>
+          <w:szCs w:val="18"/>
         </w:rPr>
         <w:object w:dxaOrig="1440" w:dyaOrig="1440" w14:anchorId="7286ED25">
           <v:shape id="Objeto 14" o:spid="_x0000_s1090" type="#_x0000_t75" style="position:absolute;left:0;text-align:left;margin-left:165.35pt;margin-top:8.35pt;width:63pt;height:18pt;z-index:251655680;visibility:visible" o:gfxdata="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">
             <v:imagedata r:id="rId11" o:title=""/>
           </v:shape>
-          <o:OLEObject Type="Embed" ProgID="Equation.3" ShapeID="Objeto 14" DrawAspect="Content" ObjectID="_1835725367" r:id="rId12"/>
+          <o:OLEObject Type="Embed" ProgID="Equation.3" ShapeID="Objeto 14" DrawAspect="Content" ObjectID="_1835931389" r:id="rId12"/>
         </w:object>
       </w:r>
       <w:r>
         <w:rPr>
           <w:rFonts w:ascii="Book Antiqua" w:hAnsi="Book Antiqua"/>
           <w:noProof/>
-          <w:sz w:val="24"/>
-          <w:szCs w:val="24"/>
+          <w:sz w:val="18"/>
+          <w:szCs w:val="18"/>
         </w:rPr>
         <w:object w:dxaOrig="1440" w:dyaOrig="1440" w14:anchorId="3D449309">
           <v:shape id="Objeto 22" o:spid="_x0000_s1091" type="#_x0000_t75" style="position:absolute;left:0;text-align:left;margin-left:298.1pt;margin-top:8.35pt;width:131pt;height:16pt;z-index:251656704;visibility:visible" o:gfxdata="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">
             <v:imagedata r:id="rId13" o:title=""/>
           </v:shape>
-          <o:OLEObject Type="Embed" ProgID="Equation.3" ShapeID="Objeto 22" DrawAspect="Content" ObjectID="_1835725368" r:id="rId14"/>
+          <o:OLEObject Type="Embed" ProgID="Equation.3" ShapeID="Objeto 22" DrawAspect="Content" ObjectID="_1835931390" r:id="rId14"/>
         </w:object>
       </w:r>
       <w:r>
         <w:rPr>
           <w:rFonts w:ascii="Book Antiqua" w:hAnsi="Book Antiqua"/>
           <w:noProof/>
-          <w:sz w:val="24"/>
-          <w:szCs w:val="24"/>
+          <w:sz w:val="18"/>
+          <w:szCs w:val="18"/>
         </w:rPr>
         <w:object w:dxaOrig="1440" w:dyaOrig="1440" w14:anchorId="0AC99E02">
           <v:shape id="Objeto 12" o:spid="_x0000_s1089" type="#_x0000_t75" style="position:absolute;left:0;text-align:left;margin-left:22.35pt;margin-top:7.35pt;width:88pt;height:18pt;z-index:251654656;visibility:visible" o:gfxdata="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">
             <v:imagedata r:id="rId15" o:title=""/>
           </v:shape>
-          <o:OLEObject Type="Embed" ProgID="Equation.3" ShapeID="Objeto 12" DrawAspect="Content" ObjectID="_1835725369" r:id="rId16"/>
+          <o:OLEObject Type="Embed" ProgID="Equation.3" ShapeID="Objeto 12" DrawAspect="Content" ObjectID="_1835931391" r:id="rId16"/>
         </w:object>
       </w:r>
     </w:p>
@@ -1466,8 +1494,8 @@
         <w:jc w:val="both"/>
         <w:rPr>
           <w:rFonts w:ascii="Book Antiqua" w:hAnsi="Book Antiqua"/>
-          <w:sz w:val="24"/>
-          <w:szCs w:val="24"/>
+          <w:sz w:val="18"/>
+          <w:szCs w:val="18"/>
         </w:rPr>
       </w:pPr>
     </w:p>
@@ -1478,97 +1506,111 @@
         <w:jc w:val="both"/>
         <w:rPr>
           <w:rFonts w:ascii="Book Antiqua" w:hAnsi="Book Antiqua"/>
-          <w:sz w:val="20"/>
-        </w:rPr>
-      </w:pPr>
-      <w:r>
-        <w:rPr>
-          <w:rFonts w:ascii="Book Antiqua" w:hAnsi="Book Antiqua"/>
-          <w:sz w:val="20"/>
+          <w:sz w:val="18"/>
+          <w:szCs w:val="18"/>
+        </w:rPr>
+      </w:pPr>
+      <w:r>
+        <w:rPr>
+          <w:rFonts w:ascii="Book Antiqua" w:hAnsi="Book Antiqua"/>
+          <w:sz w:val="18"/>
+          <w:szCs w:val="18"/>
         </w:rPr>
         <w:t>9</w:t>
       </w:r>
       <w:r>
         <w:rPr>
           <w:rFonts w:ascii="Book Antiqua" w:hAnsi="Book Antiqua"/>
-          <w:sz w:val="20"/>
+          <w:sz w:val="18"/>
+          <w:szCs w:val="18"/>
         </w:rPr>
         <w:t xml:space="preserve">) Reescreva as seguintes sentenças, usando a notação de conjuntos: a) o elemento x não pertence ao conjunto A; b) d é elemento do conjunto K; c) </w:t>
       </w:r>
       <w:r>
         <w:rPr>
           <w:rFonts w:ascii="Book Antiqua" w:hAnsi="Book Antiqua"/>
-          <w:sz w:val="20"/>
+          <w:sz w:val="18"/>
+          <w:szCs w:val="18"/>
         </w:rPr>
         <w:t>A é superconjunto de B; d) o conjunto X está contido no conjunto Y; e) o conjunto G não está contido no conjunto H</w:t>
       </w:r>
       <w:r>
         <w:rPr>
           <w:rFonts w:ascii="Book Antiqua" w:hAnsi="Book Antiqua"/>
-          <w:sz w:val="20"/>
+          <w:sz w:val="18"/>
+          <w:szCs w:val="18"/>
         </w:rPr>
         <w:t>; f) a união dos conjuntos A e B contém o conjunto A; g) o conjunto X é superconjunto da interseção dos conjuntos X e Y; h) o complementar da interseção dos conjuntos A e B é igual à união dos complementares dos conjuntos A e B;</w:t>
       </w:r>
       <w:r>
         <w:rPr>
           <w:rFonts w:ascii="Book Antiqua" w:hAnsi="Book Antiqua"/>
-          <w:sz w:val="20"/>
+          <w:sz w:val="18"/>
+          <w:szCs w:val="18"/>
         </w:rPr>
         <w:t xml:space="preserve"> i) o complementar da união dos conjuntos A e B é igual à interseção dos complementares dos conjuntos A e B; j)</w:t>
       </w:r>
       <w:r>
         <w:rPr>
           <w:rFonts w:ascii="Book Antiqua" w:hAnsi="Book Antiqua"/>
-          <w:sz w:val="20"/>
+          <w:sz w:val="18"/>
+          <w:szCs w:val="18"/>
         </w:rPr>
         <w:t xml:space="preserve"> a interseção dos conjuntos A e B está conti</w:t>
       </w:r>
       <w:r>
         <w:rPr>
           <w:rFonts w:ascii="Book Antiqua" w:hAnsi="Book Antiqua"/>
-          <w:sz w:val="20"/>
+          <w:sz w:val="18"/>
+          <w:szCs w:val="18"/>
         </w:rPr>
         <w:t xml:space="preserve">da na união dos conjuntos A e B; o conjunto </w:t>
       </w:r>
       <w:r>
         <w:rPr>
           <w:rFonts w:ascii="Book Antiqua" w:hAnsi="Book Antiqua"/>
-          <w:sz w:val="20"/>
+          <w:sz w:val="18"/>
+          <w:szCs w:val="18"/>
         </w:rPr>
         <w:t xml:space="preserve">formado pelos elementos </w:t>
       </w:r>
       <w:r>
         <w:rPr>
           <w:rFonts w:ascii="Book Antiqua" w:hAnsi="Book Antiqua"/>
-          <w:sz w:val="20"/>
+          <w:sz w:val="18"/>
+          <w:szCs w:val="18"/>
         </w:rPr>
         <w:t>x</w:t>
       </w:r>
       <w:r>
         <w:rPr>
           <w:rFonts w:ascii="Book Antiqua" w:hAnsi="Book Antiqua"/>
-          <w:sz w:val="20"/>
+          <w:sz w:val="18"/>
+          <w:szCs w:val="18"/>
         </w:rPr>
         <w:t xml:space="preserve"> e y</w:t>
       </w:r>
       <w:r>
         <w:rPr>
           <w:rFonts w:ascii="Book Antiqua" w:hAnsi="Book Antiqua"/>
-          <w:sz w:val="20"/>
+          <w:sz w:val="18"/>
+          <w:szCs w:val="18"/>
         </w:rPr>
         <w:t xml:space="preserve"> pertence ao conjunto pot</w:t>
       </w:r>
       <w:r>
         <w:rPr>
           <w:rFonts w:ascii="Book Antiqua" w:hAnsi="Book Antiqua"/>
-          <w:sz w:val="20"/>
+          <w:sz w:val="18"/>
+          <w:szCs w:val="18"/>
         </w:rPr>
         <w:t>ê</w:t>
       </w:r>
       <w:r>
         <w:rPr>
           <w:rFonts w:ascii="Book Antiqua" w:hAnsi="Book Antiqua"/>
-          <w:sz w:val="20"/>
+          <w:sz w:val="18"/>
+          <w:szCs w:val="18"/>
         </w:rPr>
         <w:t>ncia de Z.</w:t>
       </w:r>
@@ -1580,8 +1622,8 @@
         <w:jc w:val="both"/>
         <w:rPr>
           <w:rFonts w:ascii="Book Antiqua" w:hAnsi="Book Antiqua"/>
-          <w:sz w:val="24"/>
-          <w:szCs w:val="24"/>
+          <w:sz w:val="18"/>
+          <w:szCs w:val="18"/>
         </w:rPr>
       </w:pPr>
     </w:p>
@@ -1592,85 +1634,79 @@
         <w:jc w:val="both"/>
         <w:rPr>
           <w:rFonts w:ascii="Book Antiqua" w:hAnsi="Book Antiqua"/>
-          <w:sz w:val="20"/>
-        </w:rPr>
-      </w:pPr>
-      <w:r>
-        <w:rPr>
-          <w:rFonts w:ascii="Book Antiqua" w:hAnsi="Book Antiqua"/>
-          <w:sz w:val="20"/>
+          <w:sz w:val="18"/>
+          <w:szCs w:val="18"/>
+        </w:rPr>
+      </w:pPr>
+      <w:r>
+        <w:rPr>
+          <w:rFonts w:ascii="Book Antiqua" w:hAnsi="Book Antiqua"/>
+          <w:sz w:val="18"/>
+          <w:szCs w:val="18"/>
         </w:rPr>
         <w:t>10</w:t>
       </w:r>
       <w:r>
         <w:rPr>
           <w:rFonts w:ascii="Book Antiqua" w:hAnsi="Book Antiqua"/>
-          <w:sz w:val="20"/>
+          <w:sz w:val="18"/>
+          <w:szCs w:val="18"/>
         </w:rPr>
         <w:t>)</w:t>
       </w:r>
       <w:r>
         <w:rPr>
           <w:rFonts w:ascii="Book Antiqua" w:hAnsi="Book Antiqua"/>
-          <w:sz w:val="20"/>
+          <w:sz w:val="18"/>
+          <w:szCs w:val="18"/>
         </w:rPr>
         <w:t xml:space="preserve"> </w:t>
       </w:r>
       <w:r>
         <w:rPr>
           <w:rFonts w:ascii="Book Antiqua" w:hAnsi="Book Antiqua"/>
-          <w:sz w:val="20"/>
+          <w:sz w:val="18"/>
+          <w:szCs w:val="18"/>
         </w:rPr>
         <w:t xml:space="preserve"> </w:t>
       </w:r>
       <w:r>
         <w:rPr>
           <w:rFonts w:ascii="Book Antiqua" w:hAnsi="Book Antiqua"/>
-          <w:sz w:val="20"/>
-        </w:rPr>
-        <w:t>Seja A</w:t>
-      </w:r>
-      <w:proofErr w:type="gramStart"/>
-      <w:r>
-        <w:rPr>
-          <w:rFonts w:ascii="Book Antiqua" w:hAnsi="Book Antiqua"/>
-          <w:sz w:val="20"/>
-        </w:rPr>
-        <w:t>={</w:t>
-      </w:r>
-      <w:proofErr w:type="gramEnd"/>
-      <w:r>
-        <w:rPr>
-          <w:rFonts w:ascii="Book Antiqua" w:hAnsi="Book Antiqua"/>
-          <w:sz w:val="20"/>
-        </w:rPr>
-        <w:t>r, s, t, u</w:t>
-      </w:r>
-      <w:r>
-        <w:rPr>
-          <w:rFonts w:ascii="Book Antiqua" w:hAnsi="Book Antiqua"/>
-          <w:sz w:val="20"/>
+          <w:sz w:val="18"/>
+          <w:szCs w:val="18"/>
+        </w:rPr>
+        <w:t>Seja A={r, s, t, u</w:t>
+      </w:r>
+      <w:r>
+        <w:rPr>
+          <w:rFonts w:ascii="Book Antiqua" w:hAnsi="Book Antiqua"/>
+          <w:sz w:val="18"/>
+          <w:szCs w:val="18"/>
         </w:rPr>
         <w:t>, v</w:t>
       </w:r>
       <w:r>
         <w:rPr>
           <w:rFonts w:ascii="Book Antiqua" w:hAnsi="Book Antiqua"/>
-          <w:sz w:val="20"/>
+          <w:sz w:val="18"/>
+          <w:szCs w:val="18"/>
         </w:rPr>
         <w:t xml:space="preserve">}. Estabeleça a assertiva, certa ou errada, justificando o </w:t>
       </w:r>
       <w:r>
         <w:rPr>
           <w:rFonts w:ascii="Book Antiqua" w:hAnsi="Book Antiqua"/>
-          <w:sz w:val="20"/>
+          <w:sz w:val="18"/>
+          <w:szCs w:val="18"/>
         </w:rPr>
         <w:t>porquê</w:t>
       </w:r>
       <w:r>
         <w:rPr>
           <w:rFonts w:ascii="Book Antiqua" w:hAnsi="Book Antiqua"/>
-          <w:sz w:val="20"/>
+          <w:sz w:val="18"/>
+          <w:szCs w:val="18"/>
         </w:rPr>
         <w:t>:</w:t>
       </w:r>
@@ -1682,33 +1718,37 @@
         <w:jc w:val="both"/>
         <w:rPr>
           <w:rFonts w:ascii="Book Antiqua" w:hAnsi="Book Antiqua"/>
-          <w:sz w:val="20"/>
+          <w:sz w:val="18"/>
+          <w:szCs w:val="18"/>
         </w:rPr>
       </w:pPr>
       <w:r>
         <w:rPr>
           <w:rFonts w:ascii="Book Antiqua" w:hAnsi="Book Antiqua"/>
           <w:position w:val="-10"/>
-          <w:sz w:val="20"/>
+          <w:sz w:val="18"/>
+          <w:szCs w:val="18"/>
         </w:rPr>
         <w:object w:dxaOrig="780" w:dyaOrig="320" w14:anchorId="73BF6F1E">
           <v:shape id="_x0000_i1031" type="#_x0000_t75" style="width:38.8pt;height:16pt" o:ole="">
             <v:imagedata r:id="rId17" o:title=""/>
           </v:shape>
-          <o:OLEObject Type="Embed" ProgID="Equation.3" ShapeID="_x0000_i1031" DrawAspect="Content" ObjectID="_1835725351" r:id="rId18"/>
+          <o:OLEObject Type="Embed" ProgID="Equation.3" ShapeID="_x0000_i1031" DrawAspect="Content" ObjectID="_1835931373" r:id="rId18"/>
         </w:object>
       </w:r>
       <w:r>
         <w:rPr>
           <w:rFonts w:ascii="Book Antiqua" w:hAnsi="Book Antiqua"/>
-          <w:sz w:val="20"/>
+          <w:sz w:val="18"/>
+          <w:szCs w:val="18"/>
         </w:rPr>
         <w:tab/>
       </w:r>
       <w:r>
         <w:rPr>
           <w:rFonts w:ascii="Book Antiqua" w:hAnsi="Book Antiqua"/>
-          <w:sz w:val="20"/>
+          <w:sz w:val="18"/>
+          <w:szCs w:val="18"/>
         </w:rPr>
         <w:tab/>
       </w:r>
@@ -1716,26 +1756,29 @@
         <w:rPr>
           <w:rFonts w:ascii="Book Antiqua" w:hAnsi="Book Antiqua"/>
           <w:position w:val="-10"/>
-          <w:sz w:val="20"/>
+          <w:sz w:val="18"/>
+          <w:szCs w:val="18"/>
         </w:rPr>
         <w:object w:dxaOrig="840" w:dyaOrig="320" w14:anchorId="1216BB2D">
           <v:shape id="_x0000_i1032" type="#_x0000_t75" style="width:42pt;height:16pt" o:ole="">
             <v:imagedata r:id="rId19" o:title=""/>
           </v:shape>
-          <o:OLEObject Type="Embed" ProgID="Equation.3" ShapeID="_x0000_i1032" DrawAspect="Content" ObjectID="_1835725352" r:id="rId20"/>
+          <o:OLEObject Type="Embed" ProgID="Equation.3" ShapeID="_x0000_i1032" DrawAspect="Content" ObjectID="_1835931374" r:id="rId20"/>
         </w:object>
       </w:r>
       <w:r>
         <w:rPr>
           <w:rFonts w:ascii="Book Antiqua" w:hAnsi="Book Antiqua"/>
-          <w:sz w:val="20"/>
+          <w:sz w:val="18"/>
+          <w:szCs w:val="18"/>
         </w:rPr>
         <w:tab/>
       </w:r>
       <w:r>
         <w:rPr>
           <w:rFonts w:ascii="Book Antiqua" w:hAnsi="Book Antiqua"/>
-          <w:sz w:val="20"/>
+          <w:sz w:val="18"/>
+          <w:szCs w:val="18"/>
         </w:rPr>
         <w:tab/>
       </w:r>
@@ -1743,26 +1786,29 @@
         <w:rPr>
           <w:rFonts w:ascii="Book Antiqua" w:hAnsi="Book Antiqua"/>
           <w:position w:val="-10"/>
-          <w:sz w:val="20"/>
+          <w:sz w:val="18"/>
+          <w:szCs w:val="18"/>
         </w:rPr>
         <w:object w:dxaOrig="1359" w:dyaOrig="320" w14:anchorId="0D1768C5">
           <v:shape id="_x0000_i1033" type="#_x0000_t75" style="width:67.6pt;height:16pt" o:ole="">
             <v:imagedata r:id="rId21" o:title=""/>
           </v:shape>
-          <o:OLEObject Type="Embed" ProgID="Equation.3" ShapeID="_x0000_i1033" DrawAspect="Content" ObjectID="_1835725353" r:id="rId22"/>
+          <o:OLEObject Type="Embed" ProgID="Equation.3" ShapeID="_x0000_i1033" DrawAspect="Content" ObjectID="_1835931375" r:id="rId22"/>
         </w:object>
       </w:r>
       <w:r>
         <w:rPr>
           <w:rFonts w:ascii="Book Antiqua" w:hAnsi="Book Antiqua"/>
-          <w:sz w:val="20"/>
+          <w:sz w:val="18"/>
+          <w:szCs w:val="18"/>
         </w:rPr>
         <w:tab/>
       </w:r>
       <w:r>
         <w:rPr>
           <w:rFonts w:ascii="Book Antiqua" w:hAnsi="Book Antiqua"/>
-          <w:sz w:val="20"/>
+          <w:sz w:val="18"/>
+          <w:szCs w:val="18"/>
         </w:rPr>
         <w:tab/>
       </w:r>
@@ -1770,19 +1816,21 @@
         <w:rPr>
           <w:rFonts w:ascii="Book Antiqua" w:hAnsi="Book Antiqua"/>
           <w:position w:val="-10"/>
-          <w:sz w:val="20"/>
+          <w:sz w:val="18"/>
+          <w:szCs w:val="18"/>
         </w:rPr>
         <w:object w:dxaOrig="1240" w:dyaOrig="320" w14:anchorId="561B029D">
           <v:shape id="_x0000_i1034" type="#_x0000_t75" style="width:62.35pt;height:16pt" o:ole="">
             <v:imagedata r:id="rId23" o:title=""/>
           </v:shape>
-          <o:OLEObject Type="Embed" ProgID="Equation.3" ShapeID="_x0000_i1034" DrawAspect="Content" ObjectID="_1835725354" r:id="rId24"/>
+          <o:OLEObject Type="Embed" ProgID="Equation.3" ShapeID="_x0000_i1034" DrawAspect="Content" ObjectID="_1835931376" r:id="rId24"/>
         </w:object>
       </w:r>
       <w:r>
         <w:rPr>
           <w:rFonts w:ascii="Book Antiqua" w:hAnsi="Book Antiqua"/>
-          <w:sz w:val="20"/>
+          <w:sz w:val="18"/>
+          <w:szCs w:val="18"/>
         </w:rPr>
         <w:tab/>
       </w:r>
@@ -1794,33 +1842,37 @@
         <w:jc w:val="both"/>
         <w:rPr>
           <w:rFonts w:ascii="Book Antiqua" w:hAnsi="Book Antiqua"/>
-          <w:sz w:val="20"/>
+          <w:sz w:val="18"/>
+          <w:szCs w:val="18"/>
         </w:rPr>
       </w:pPr>
       <w:r>
         <w:rPr>
           <w:rFonts w:ascii="Book Antiqua" w:hAnsi="Book Antiqua"/>
           <w:position w:val="-10"/>
-          <w:sz w:val="20"/>
+          <w:sz w:val="18"/>
+          <w:szCs w:val="18"/>
         </w:rPr>
         <w:object w:dxaOrig="1120" w:dyaOrig="320" w14:anchorId="654031F3">
           <v:shape id="_x0000_i1035" type="#_x0000_t75" style="width:56pt;height:16pt" o:ole="">
             <v:imagedata r:id="rId25" o:title=""/>
           </v:shape>
-          <o:OLEObject Type="Embed" ProgID="Equation.3" ShapeID="_x0000_i1035" DrawAspect="Content" ObjectID="_1835725355" r:id="rId26"/>
+          <o:OLEObject Type="Embed" ProgID="Equation.3" ShapeID="_x0000_i1035" DrawAspect="Content" ObjectID="_1835931377" r:id="rId26"/>
         </w:object>
       </w:r>
       <w:r>
         <w:rPr>
           <w:rFonts w:ascii="Book Antiqua" w:hAnsi="Book Antiqua"/>
-          <w:sz w:val="20"/>
+          <w:sz w:val="18"/>
+          <w:szCs w:val="18"/>
         </w:rPr>
         <w:tab/>
       </w:r>
       <w:r>
         <w:rPr>
           <w:rFonts w:ascii="Book Antiqua" w:hAnsi="Book Antiqua"/>
-          <w:sz w:val="20"/>
+          <w:sz w:val="18"/>
+          <w:szCs w:val="18"/>
         </w:rPr>
         <w:tab/>
       </w:r>
@@ -1828,26 +1880,29 @@
         <w:rPr>
           <w:rFonts w:ascii="Book Antiqua" w:hAnsi="Book Antiqua"/>
           <w:position w:val="-10"/>
-          <w:sz w:val="20"/>
+          <w:sz w:val="18"/>
+          <w:szCs w:val="18"/>
         </w:rPr>
         <w:object w:dxaOrig="900" w:dyaOrig="320" w14:anchorId="6AC92D36">
           <v:shape id="_x0000_i1036" type="#_x0000_t75" style="width:45.2pt;height:16pt" o:ole="">
             <v:imagedata r:id="rId27" o:title=""/>
           </v:shape>
-          <o:OLEObject Type="Embed" ProgID="Equation.3" ShapeID="_x0000_i1036" DrawAspect="Content" ObjectID="_1835725356" r:id="rId28"/>
+          <o:OLEObject Type="Embed" ProgID="Equation.3" ShapeID="_x0000_i1036" DrawAspect="Content" ObjectID="_1835931378" r:id="rId28"/>
         </w:object>
       </w:r>
       <w:r>
         <w:rPr>
           <w:rFonts w:ascii="Book Antiqua" w:hAnsi="Book Antiqua"/>
-          <w:sz w:val="20"/>
+          <w:sz w:val="18"/>
+          <w:szCs w:val="18"/>
         </w:rPr>
         <w:tab/>
       </w:r>
       <w:r>
         <w:rPr>
           <w:rFonts w:ascii="Book Antiqua" w:hAnsi="Book Antiqua"/>
-          <w:sz w:val="20"/>
+          <w:sz w:val="18"/>
+          <w:szCs w:val="18"/>
         </w:rPr>
         <w:tab/>
       </w:r>
@@ -1855,26 +1910,29 @@
         <w:rPr>
           <w:rFonts w:ascii="Book Antiqua" w:hAnsi="Book Antiqua"/>
           <w:position w:val="-10"/>
-          <w:sz w:val="20"/>
+          <w:sz w:val="18"/>
+          <w:szCs w:val="18"/>
         </w:rPr>
         <w:object w:dxaOrig="940" w:dyaOrig="320" w14:anchorId="42D86D13">
           <v:shape id="_x0000_i1037" type="#_x0000_t75" style="width:47.2pt;height:16pt" o:ole="">
             <v:imagedata r:id="rId29" o:title=""/>
           </v:shape>
-          <o:OLEObject Type="Embed" ProgID="Equation.3" ShapeID="_x0000_i1037" DrawAspect="Content" ObjectID="_1835725357" r:id="rId30"/>
+          <o:OLEObject Type="Embed" ProgID="Equation.3" ShapeID="_x0000_i1037" DrawAspect="Content" ObjectID="_1835931379" r:id="rId30"/>
         </w:object>
       </w:r>
       <w:r>
         <w:rPr>
           <w:rFonts w:ascii="Book Antiqua" w:hAnsi="Book Antiqua"/>
-          <w:sz w:val="20"/>
+          <w:sz w:val="18"/>
+          <w:szCs w:val="18"/>
         </w:rPr>
         <w:tab/>
       </w:r>
       <w:r>
         <w:rPr>
           <w:rFonts w:ascii="Book Antiqua" w:hAnsi="Book Antiqua"/>
-          <w:sz w:val="20"/>
+          <w:sz w:val="18"/>
+          <w:szCs w:val="18"/>
         </w:rPr>
         <w:tab/>
       </w:r>
@@ -1882,13 +1940,14 @@
         <w:rPr>
           <w:rFonts w:ascii="Book Antiqua" w:hAnsi="Book Antiqua"/>
           <w:position w:val="-10"/>
-          <w:sz w:val="20"/>
+          <w:sz w:val="18"/>
+          <w:szCs w:val="18"/>
         </w:rPr>
         <w:object w:dxaOrig="1160" w:dyaOrig="320" w14:anchorId="03DD4082">
           <v:shape id="_x0000_i1038" type="#_x0000_t75" style="width:58pt;height:16pt" o:ole="">
             <v:imagedata r:id="rId31" o:title=""/>
           </v:shape>
-          <o:OLEObject Type="Embed" ProgID="Equation.3" ShapeID="_x0000_i1038" DrawAspect="Content" ObjectID="_1835725358" r:id="rId32"/>
+          <o:OLEObject Type="Embed" ProgID="Equation.3" ShapeID="_x0000_i1038" DrawAspect="Content" ObjectID="_1835931380" r:id="rId32"/>
         </w:object>
       </w:r>
     </w:p>
@@ -1899,7 +1958,8 @@
         <w:jc w:val="both"/>
         <w:rPr>
           <w:rFonts w:ascii="Book Antiqua" w:hAnsi="Book Antiqua"/>
-          <w:sz w:val="20"/>
+          <w:sz w:val="18"/>
+          <w:szCs w:val="18"/>
         </w:rPr>
       </w:pPr>
     </w:p>
@@ -1910,27 +1970,31 @@
         <w:jc w:val="both"/>
         <w:rPr>
           <w:rFonts w:ascii="Book Antiqua" w:hAnsi="Book Antiqua"/>
-          <w:sz w:val="20"/>
-        </w:rPr>
-      </w:pPr>
-      <w:r>
-        <w:rPr>
-          <w:rFonts w:ascii="Book Antiqua" w:hAnsi="Book Antiqua"/>
-          <w:sz w:val="20"/>
+          <w:sz w:val="18"/>
+          <w:szCs w:val="18"/>
+        </w:rPr>
+      </w:pPr>
+      <w:r>
+        <w:rPr>
+          <w:rFonts w:ascii="Book Antiqua" w:hAnsi="Book Antiqua"/>
+          <w:sz w:val="18"/>
+          <w:szCs w:val="18"/>
         </w:rPr>
         <w:t>11</w:t>
       </w:r>
       <w:r>
         <w:rPr>
           <w:rFonts w:ascii="Book Antiqua" w:hAnsi="Book Antiqua"/>
-          <w:sz w:val="20"/>
+          <w:sz w:val="18"/>
+          <w:szCs w:val="18"/>
         </w:rPr>
         <w:t xml:space="preserve">) </w:t>
       </w:r>
       <w:r>
         <w:rPr>
           <w:rFonts w:ascii="Book Antiqua" w:hAnsi="Book Antiqua"/>
-          <w:sz w:val="20"/>
+          <w:sz w:val="18"/>
+          <w:szCs w:val="18"/>
         </w:rPr>
         <w:t>Dado A, determine P(A), se:</w:t>
       </w:r>
@@ -1942,27 +2006,31 @@
         <w:jc w:val="both"/>
         <w:rPr>
           <w:rFonts w:ascii="Book Antiqua" w:hAnsi="Book Antiqua"/>
-          <w:sz w:val="20"/>
-        </w:rPr>
-      </w:pPr>
-      <w:r>
-        <w:rPr>
-          <w:rFonts w:ascii="Book Antiqua" w:hAnsi="Book Antiqua"/>
-          <w:sz w:val="20"/>
+          <w:sz w:val="18"/>
+          <w:szCs w:val="18"/>
+        </w:rPr>
+      </w:pPr>
+      <w:r>
+        <w:rPr>
+          <w:rFonts w:ascii="Book Antiqua" w:hAnsi="Book Antiqua"/>
+          <w:sz w:val="18"/>
+          <w:szCs w:val="18"/>
         </w:rPr>
         <w:t>a) A={3,1,4}</w:t>
       </w:r>
       <w:r>
         <w:rPr>
           <w:rFonts w:ascii="Book Antiqua" w:hAnsi="Book Antiqua"/>
-          <w:sz w:val="20"/>
+          <w:sz w:val="18"/>
+          <w:szCs w:val="18"/>
         </w:rPr>
         <w:tab/>
       </w:r>
       <w:r>
         <w:rPr>
           <w:rFonts w:ascii="Book Antiqua" w:hAnsi="Book Antiqua"/>
-          <w:sz w:val="20"/>
+          <w:sz w:val="18"/>
+          <w:szCs w:val="18"/>
         </w:rPr>
         <w:tab/>
         <w:t>b) A= {{3, 1},4}</w:t>
@@ -1970,14 +2038,16 @@
       <w:r>
         <w:rPr>
           <w:rFonts w:ascii="Book Antiqua" w:hAnsi="Book Antiqua"/>
-          <w:sz w:val="20"/>
+          <w:sz w:val="18"/>
+          <w:szCs w:val="18"/>
         </w:rPr>
         <w:tab/>
       </w:r>
       <w:r>
         <w:rPr>
           <w:rFonts w:ascii="Book Antiqua" w:hAnsi="Book Antiqua"/>
-          <w:sz w:val="20"/>
+          <w:sz w:val="18"/>
+          <w:szCs w:val="18"/>
         </w:rPr>
         <w:tab/>
         <w:t>c) A={1, 2, x, y}</w:t>
@@ -1985,7 +2055,8 @@
       <w:r>
         <w:rPr>
           <w:rFonts w:ascii="Book Antiqua" w:hAnsi="Book Antiqua"/>
-          <w:sz w:val="20"/>
+          <w:sz w:val="18"/>
+          <w:szCs w:val="18"/>
         </w:rPr>
         <w:tab/>
       </w:r>
@@ -1997,7 +2068,8 @@
         <w:jc w:val="both"/>
         <w:rPr>
           <w:rFonts w:ascii="Book Antiqua" w:hAnsi="Book Antiqua"/>
-          <w:sz w:val="20"/>
+          <w:sz w:val="18"/>
+          <w:szCs w:val="18"/>
         </w:rPr>
       </w:pPr>
     </w:p>
@@ -2008,70 +2080,25 @@
         <w:jc w:val="both"/>
         <w:rPr>
           <w:rFonts w:ascii="Book Antiqua" w:hAnsi="Book Antiqua"/>
-          <w:sz w:val="20"/>
-        </w:rPr>
-      </w:pPr>
-      <w:r>
-        <w:rPr>
-          <w:rFonts w:ascii="Book Antiqua" w:hAnsi="Book Antiqua"/>
-          <w:sz w:val="20"/>
+          <w:sz w:val="18"/>
+          <w:szCs w:val="18"/>
+        </w:rPr>
+      </w:pPr>
+      <w:r>
+        <w:rPr>
+          <w:rFonts w:ascii="Book Antiqua" w:hAnsi="Book Antiqua"/>
+          <w:sz w:val="18"/>
+          <w:szCs w:val="18"/>
         </w:rPr>
         <w:t>12</w:t>
       </w:r>
       <w:r>
         <w:rPr>
           <w:rFonts w:ascii="Book Antiqua" w:hAnsi="Book Antiqua"/>
-          <w:sz w:val="20"/>
-        </w:rPr>
-        <w:t>) Dados os conjuntos A</w:t>
-      </w:r>
-      <w:proofErr w:type="gramStart"/>
-      <w:r>
-        <w:rPr>
-          <w:rFonts w:ascii="Book Antiqua" w:hAnsi="Book Antiqua"/>
-          <w:sz w:val="20"/>
-        </w:rPr>
-        <w:t>={</w:t>
-      </w:r>
-      <w:proofErr w:type="gramEnd"/>
-      <w:r>
-        <w:rPr>
-          <w:rFonts w:ascii="Book Antiqua" w:hAnsi="Book Antiqua"/>
-          <w:sz w:val="20"/>
-        </w:rPr>
-        <w:t>0, 1}, B</w:t>
-      </w:r>
-      <w:proofErr w:type="gramStart"/>
-      <w:r>
-        <w:rPr>
-          <w:rFonts w:ascii="Book Antiqua" w:hAnsi="Book Antiqua"/>
-          <w:sz w:val="20"/>
-        </w:rPr>
-        <w:t>={</w:t>
-      </w:r>
-      <w:proofErr w:type="gramEnd"/>
-      <w:r>
-        <w:rPr>
-          <w:rFonts w:ascii="Book Antiqua" w:hAnsi="Book Antiqua"/>
-          <w:sz w:val="20"/>
-        </w:rPr>
-        <w:t>0, 1, 2} e C</w:t>
-      </w:r>
-      <w:proofErr w:type="gramStart"/>
-      <w:r>
-        <w:rPr>
-          <w:rFonts w:ascii="Book Antiqua" w:hAnsi="Book Antiqua"/>
-          <w:sz w:val="20"/>
-        </w:rPr>
-        <w:t>={</w:t>
-      </w:r>
-      <w:proofErr w:type="gramEnd"/>
-      <w:r>
-        <w:rPr>
-          <w:rFonts w:ascii="Book Antiqua" w:hAnsi="Book Antiqua"/>
-          <w:sz w:val="20"/>
-        </w:rPr>
-        <w:t>2, 3}, determine:</w:t>
+          <w:sz w:val="18"/>
+          <w:szCs w:val="18"/>
+        </w:rPr>
+        <w:t>) Dados os conjuntos A={0, 1}, B={0, 1, 2} e C={2, 3}, determine:</w:t>
       </w:r>
     </w:p>
     <w:p>
@@ -2081,47 +2108,53 @@
         <w:jc w:val="both"/>
         <w:rPr>
           <w:rFonts w:ascii="Book Antiqua" w:hAnsi="Book Antiqua"/>
-          <w:sz w:val="20"/>
+          <w:sz w:val="18"/>
+          <w:szCs w:val="18"/>
         </w:rPr>
       </w:pPr>
       <w:r>
         <w:rPr>
           <w:rFonts w:ascii="Book Antiqua" w:hAnsi="Book Antiqua"/>
           <w:position w:val="-172"/>
-          <w:sz w:val="20"/>
+          <w:sz w:val="18"/>
+          <w:szCs w:val="18"/>
         </w:rPr>
         <w:object w:dxaOrig="2079" w:dyaOrig="3560" w14:anchorId="5A005D18">
           <v:shape id="_x0000_i1039" type="#_x0000_t75" style="width:103.2pt;height:177.3pt" o:ole="">
             <v:imagedata r:id="rId33" o:title=""/>
           </v:shape>
-          <o:OLEObject Type="Embed" ProgID="Equation.3" ShapeID="_x0000_i1039" DrawAspect="Content" ObjectID="_1835725359" r:id="rId34"/>
+          <o:OLEObject Type="Embed" ProgID="Equation.3" ShapeID="_x0000_i1039" DrawAspect="Content" ObjectID="_1835931381" r:id="rId34"/>
         </w:object>
       </w:r>
       <w:r>
         <w:rPr>
           <w:rFonts w:ascii="Book Antiqua" w:hAnsi="Book Antiqua"/>
-          <w:sz w:val="20"/>
+          <w:sz w:val="18"/>
+          <w:szCs w:val="18"/>
         </w:rPr>
         <w:tab/>
       </w:r>
       <w:r>
         <w:rPr>
           <w:rFonts w:ascii="Book Antiqua" w:hAnsi="Book Antiqua"/>
-          <w:sz w:val="20"/>
+          <w:sz w:val="18"/>
+          <w:szCs w:val="18"/>
         </w:rPr>
         <w:tab/>
       </w:r>
       <w:r>
         <w:rPr>
           <w:rFonts w:ascii="Book Antiqua" w:hAnsi="Book Antiqua"/>
-          <w:sz w:val="20"/>
+          <w:sz w:val="18"/>
+          <w:szCs w:val="18"/>
         </w:rPr>
         <w:tab/>
       </w:r>
       <w:r>
         <w:rPr>
           <w:rFonts w:ascii="Book Antiqua" w:hAnsi="Book Antiqua"/>
-          <w:sz w:val="20"/>
+          <w:sz w:val="18"/>
+          <w:szCs w:val="18"/>
         </w:rPr>
         <w:tab/>
       </w:r>
@@ -2129,13 +2162,14 @@
         <w:rPr>
           <w:rFonts w:ascii="Book Antiqua" w:hAnsi="Book Antiqua"/>
           <w:position w:val="-172"/>
-          <w:sz w:val="20"/>
+          <w:sz w:val="18"/>
+          <w:szCs w:val="18"/>
         </w:rPr>
         <w:object w:dxaOrig="2100" w:dyaOrig="3560" w14:anchorId="5B003F74">
           <v:shape id="_x0000_i1040" type="#_x0000_t75" style="width:105.2pt;height:177.3pt" o:ole="">
             <v:imagedata r:id="rId35" o:title=""/>
           </v:shape>
-          <o:OLEObject Type="Embed" ProgID="Equation.3" ShapeID="_x0000_i1040" DrawAspect="Content" ObjectID="_1835725360" r:id="rId36"/>
+          <o:OLEObject Type="Embed" ProgID="Equation.3" ShapeID="_x0000_i1040" DrawAspect="Content" ObjectID="_1835931382" r:id="rId36"/>
         </w:object>
       </w:r>
     </w:p>
@@ -2146,7 +2180,8 @@
         <w:jc w:val="both"/>
         <w:rPr>
           <w:rFonts w:ascii="Book Antiqua" w:hAnsi="Book Antiqua"/>
-          <w:sz w:val="20"/>
+          <w:sz w:val="18"/>
+          <w:szCs w:val="18"/>
         </w:rPr>
       </w:pPr>
     </w:p>
@@ -2157,45 +2192,33 @@
         <w:jc w:val="both"/>
         <w:rPr>
           <w:rFonts w:ascii="Book Antiqua" w:hAnsi="Book Antiqua"/>
-          <w:sz w:val="20"/>
-        </w:rPr>
-      </w:pPr>
-      <w:r>
-        <w:rPr>
-          <w:rFonts w:ascii="Book Antiqua" w:hAnsi="Book Antiqua"/>
-          <w:sz w:val="20"/>
+          <w:sz w:val="18"/>
+          <w:szCs w:val="18"/>
+        </w:rPr>
+      </w:pPr>
+      <w:r>
+        <w:rPr>
+          <w:rFonts w:ascii="Book Antiqua" w:hAnsi="Book Antiqua"/>
+          <w:sz w:val="18"/>
+          <w:szCs w:val="18"/>
         </w:rPr>
         <w:t>13</w:t>
       </w:r>
       <w:r>
         <w:rPr>
           <w:rFonts w:ascii="Book Antiqua" w:hAnsi="Book Antiqua"/>
-          <w:sz w:val="20"/>
+          <w:sz w:val="18"/>
+          <w:szCs w:val="18"/>
         </w:rPr>
         <w:t xml:space="preserve">) </w:t>
       </w:r>
       <w:r>
         <w:rPr>
           <w:rFonts w:ascii="Book Antiqua" w:hAnsi="Book Antiqua"/>
-          <w:sz w:val="20"/>
-        </w:rPr>
-        <w:t xml:space="preserve">Num avião, os passageiros são de 4 nacionalidades: argentina, brasileira, colombiana e dominicana, nas seguintes proporções: 20% de argentinos, 85% de não colombianos e 70% de não dominicanos, </w:t>
-      </w:r>
-      <w:proofErr w:type="gramStart"/>
-      <w:r>
-        <w:rPr>
-          <w:rFonts w:ascii="Book Antiqua" w:hAnsi="Book Antiqua"/>
-          <w:sz w:val="20"/>
-        </w:rPr>
-        <w:t>Qual</w:t>
-      </w:r>
-      <w:proofErr w:type="gramEnd"/>
-      <w:r>
-        <w:rPr>
-          <w:rFonts w:ascii="Book Antiqua" w:hAnsi="Book Antiqua"/>
-          <w:sz w:val="20"/>
-        </w:rPr>
-        <w:t xml:space="preserve"> a porcentagem de passageiros que:</w:t>
+          <w:sz w:val="18"/>
+          <w:szCs w:val="18"/>
+        </w:rPr>
+        <w:t>Num avião, os passageiros são de 4 nacionalidades: argentina, brasileira, colombiana e dominicana, nas seguintes proporções: 20% de argentinos, 85% de não colombianos e 70% de não dominicanos, Qual a porcentagem de passageiros que:</w:t>
       </w:r>
     </w:p>
     <w:p>
@@ -2208,13 +2231,15 @@
         <w:jc w:val="both"/>
         <w:rPr>
           <w:rFonts w:ascii="Book Antiqua" w:hAnsi="Book Antiqua"/>
-          <w:sz w:val="20"/>
-        </w:rPr>
-      </w:pPr>
-      <w:r>
-        <w:rPr>
-          <w:rFonts w:ascii="Book Antiqua" w:hAnsi="Book Antiqua"/>
-          <w:sz w:val="20"/>
+          <w:sz w:val="18"/>
+          <w:szCs w:val="18"/>
+        </w:rPr>
+      </w:pPr>
+      <w:r>
+        <w:rPr>
+          <w:rFonts w:ascii="Book Antiqua" w:hAnsi="Book Antiqua"/>
+          <w:sz w:val="18"/>
+          <w:szCs w:val="18"/>
         </w:rPr>
         <w:t>São brasileiros?</w:t>
       </w:r>
@@ -2229,13 +2254,15 @@
         <w:jc w:val="both"/>
         <w:rPr>
           <w:rFonts w:ascii="Book Antiqua" w:hAnsi="Book Antiqua"/>
-          <w:sz w:val="20"/>
-        </w:rPr>
-      </w:pPr>
-      <w:r>
-        <w:rPr>
-          <w:rFonts w:ascii="Book Antiqua" w:hAnsi="Book Antiqua"/>
-          <w:sz w:val="20"/>
+          <w:sz w:val="18"/>
+          <w:szCs w:val="18"/>
+        </w:rPr>
+      </w:pPr>
+      <w:r>
+        <w:rPr>
+          <w:rFonts w:ascii="Book Antiqua" w:hAnsi="Book Antiqua"/>
+          <w:sz w:val="18"/>
+          <w:szCs w:val="18"/>
         </w:rPr>
         <w:t>São argentinos ou colombianos</w:t>
       </w:r>
@@ -2250,14 +2277,17 @@
         <w:jc w:val="both"/>
         <w:rPr>
           <w:rFonts w:ascii="Book Antiqua" w:hAnsi="Book Antiqua"/>
-          <w:sz w:val="20"/>
-        </w:rPr>
-      </w:pPr>
-      <w:r>
-        <w:rPr>
-          <w:rFonts w:ascii="Book Antiqua" w:hAnsi="Book Antiqua"/>
-          <w:sz w:val="20"/>
-        </w:rPr>
+          <w:sz w:val="18"/>
+          <w:szCs w:val="18"/>
+        </w:rPr>
+      </w:pPr>
+      <w:r>
+        <w:rPr>
+          <w:rFonts w:ascii="Book Antiqua" w:hAnsi="Book Antiqua"/>
+          <w:sz w:val="18"/>
+          <w:szCs w:val="18"/>
+        </w:rPr>
+        <w:lastRenderedPageBreak/>
         <w:t>Não são brasileiros ou colombianos</w:t>
       </w:r>
     </w:p>
@@ -2271,13 +2301,15 @@
         <w:jc w:val="both"/>
         <w:rPr>
           <w:rFonts w:ascii="Book Antiqua" w:hAnsi="Book Antiqua"/>
-          <w:sz w:val="20"/>
-        </w:rPr>
-      </w:pPr>
-      <w:r>
-        <w:rPr>
-          <w:rFonts w:ascii="Book Antiqua" w:hAnsi="Book Antiqua"/>
-          <w:sz w:val="20"/>
+          <w:sz w:val="18"/>
+          <w:szCs w:val="18"/>
+        </w:rPr>
+      </w:pPr>
+      <w:r>
+        <w:rPr>
+          <w:rFonts w:ascii="Book Antiqua" w:hAnsi="Book Antiqua"/>
+          <w:sz w:val="18"/>
+          <w:szCs w:val="18"/>
         </w:rPr>
         <w:t>Não são brasileiros ou não são dominicanos</w:t>
       </w:r>
@@ -2292,27 +2324,31 @@
         <w:jc w:val="both"/>
         <w:rPr>
           <w:rFonts w:ascii="Book Antiqua" w:hAnsi="Book Antiqua"/>
-          <w:sz w:val="20"/>
-        </w:rPr>
-      </w:pPr>
-      <w:r>
-        <w:rPr>
-          <w:rFonts w:ascii="Book Antiqua" w:hAnsi="Book Antiqua"/>
-          <w:sz w:val="20"/>
+          <w:sz w:val="18"/>
+          <w:szCs w:val="18"/>
+        </w:rPr>
+      </w:pPr>
+      <w:r>
+        <w:rPr>
+          <w:rFonts w:ascii="Book Antiqua" w:hAnsi="Book Antiqua"/>
+          <w:sz w:val="18"/>
+          <w:szCs w:val="18"/>
         </w:rPr>
         <w:t xml:space="preserve">Não são, brasileiros </w:t>
       </w:r>
       <w:r>
         <w:rPr>
           <w:rFonts w:ascii="Book Antiqua" w:hAnsi="Book Antiqua"/>
-          <w:sz w:val="20"/>
+          <w:sz w:val="18"/>
+          <w:szCs w:val="18"/>
         </w:rPr>
         <w:t>e</w:t>
       </w:r>
       <w:r>
         <w:rPr>
           <w:rFonts w:ascii="Book Antiqua" w:hAnsi="Book Antiqua"/>
-          <w:sz w:val="20"/>
+          <w:sz w:val="18"/>
+          <w:szCs w:val="18"/>
         </w:rPr>
         <w:t xml:space="preserve"> dominicanos.</w:t>
       </w:r>
@@ -2323,7 +2359,8 @@
         <w:jc w:val="both"/>
         <w:rPr>
           <w:rFonts w:ascii="Book Antiqua" w:hAnsi="Book Antiqua"/>
-          <w:sz w:val="20"/>
+          <w:sz w:val="18"/>
+          <w:szCs w:val="18"/>
         </w:rPr>
       </w:pPr>
     </w:p>
@@ -2333,41 +2370,47 @@
         <w:jc w:val="both"/>
         <w:rPr>
           <w:rFonts w:ascii="Book Antiqua" w:hAnsi="Book Antiqua"/>
-          <w:sz w:val="20"/>
-        </w:rPr>
-      </w:pPr>
-      <w:r>
-        <w:rPr>
-          <w:rFonts w:ascii="Book Antiqua" w:hAnsi="Book Antiqua"/>
-          <w:sz w:val="20"/>
+          <w:sz w:val="18"/>
+          <w:szCs w:val="18"/>
+        </w:rPr>
+      </w:pPr>
+      <w:r>
+        <w:rPr>
+          <w:rFonts w:ascii="Book Antiqua" w:hAnsi="Book Antiqua"/>
+          <w:sz w:val="18"/>
+          <w:szCs w:val="18"/>
         </w:rPr>
         <w:t>14</w:t>
       </w:r>
       <w:r>
         <w:rPr>
           <w:rFonts w:ascii="Book Antiqua" w:hAnsi="Book Antiqua"/>
-          <w:sz w:val="20"/>
+          <w:sz w:val="18"/>
+          <w:szCs w:val="18"/>
         </w:rPr>
         <w:t xml:space="preserve">) </w:t>
       </w:r>
       <w:r>
         <w:rPr>
           <w:rFonts w:ascii="Book Antiqua" w:hAnsi="Book Antiqua"/>
-          <w:sz w:val="20"/>
+          <w:sz w:val="18"/>
+          <w:szCs w:val="18"/>
         </w:rPr>
         <w:t>Uma prova de Estatística constava de 3 questões: I, II e III. A prova, aplicadas aos alunos de uma sala de aulas, apresentou o seguinte resultado: 4 alunos acertaram as 3 questões e 5 alunos erraram todas. 19 alunos erraram as questões I e II, 16 erraram as questões II e III e 10 erraram as questões I e III. 37 alunos erraram a questão II, 29 erraram a questão III e 3 erraram a questão I somente</w:t>
       </w:r>
       <w:r>
         <w:rPr>
           <w:rFonts w:ascii="Book Antiqua" w:hAnsi="Book Antiqua"/>
-          <w:sz w:val="20"/>
+          <w:sz w:val="18"/>
+          <w:szCs w:val="18"/>
         </w:rPr>
         <w:t>. Pergunta-se</w:t>
       </w:r>
       <w:r>
         <w:rPr>
           <w:rFonts w:ascii="Book Antiqua" w:hAnsi="Book Antiqua"/>
-          <w:sz w:val="20"/>
+          <w:sz w:val="18"/>
+          <w:szCs w:val="18"/>
         </w:rPr>
         <w:t xml:space="preserve"> quantos alunos:</w:t>
       </w:r>
@@ -2382,13 +2425,15 @@
         <w:jc w:val="both"/>
         <w:rPr>
           <w:rFonts w:ascii="Book Antiqua" w:hAnsi="Book Antiqua"/>
-          <w:sz w:val="20"/>
-        </w:rPr>
-      </w:pPr>
-      <w:r>
-        <w:rPr>
-          <w:rFonts w:ascii="Book Antiqua" w:hAnsi="Book Antiqua"/>
-          <w:sz w:val="20"/>
+          <w:sz w:val="18"/>
+          <w:szCs w:val="18"/>
+        </w:rPr>
+      </w:pPr>
+      <w:r>
+        <w:rPr>
+          <w:rFonts w:ascii="Book Antiqua" w:hAnsi="Book Antiqua"/>
+          <w:sz w:val="18"/>
+          <w:szCs w:val="18"/>
         </w:rPr>
         <w:t>Acertaram apenas duas questões?</w:t>
       </w:r>
@@ -2403,13 +2448,15 @@
         <w:jc w:val="both"/>
         <w:rPr>
           <w:rFonts w:ascii="Book Antiqua" w:hAnsi="Book Antiqua"/>
-          <w:sz w:val="20"/>
-        </w:rPr>
-      </w:pPr>
-      <w:r>
-        <w:rPr>
-          <w:rFonts w:ascii="Book Antiqua" w:hAnsi="Book Antiqua"/>
-          <w:sz w:val="20"/>
+          <w:sz w:val="18"/>
+          <w:szCs w:val="18"/>
+        </w:rPr>
+      </w:pPr>
+      <w:r>
+        <w:rPr>
+          <w:rFonts w:ascii="Book Antiqua" w:hAnsi="Book Antiqua"/>
+          <w:sz w:val="18"/>
+          <w:szCs w:val="18"/>
         </w:rPr>
         <w:t>Erraram apenas uma questão?</w:t>
       </w:r>
@@ -2424,13 +2471,15 @@
         <w:jc w:val="both"/>
         <w:rPr>
           <w:rFonts w:ascii="Book Antiqua" w:hAnsi="Book Antiqua"/>
-          <w:sz w:val="20"/>
-        </w:rPr>
-      </w:pPr>
-      <w:r>
-        <w:rPr>
-          <w:rFonts w:ascii="Book Antiqua" w:hAnsi="Book Antiqua"/>
-          <w:sz w:val="20"/>
+          <w:sz w:val="18"/>
+          <w:szCs w:val="18"/>
+        </w:rPr>
+      </w:pPr>
+      <w:r>
+        <w:rPr>
+          <w:rFonts w:ascii="Book Antiqua" w:hAnsi="Book Antiqua"/>
+          <w:sz w:val="18"/>
+          <w:szCs w:val="18"/>
         </w:rPr>
         <w:t>Fizeram a prova?</w:t>
       </w:r>
@@ -2441,7 +2490,8 @@
         <w:jc w:val="both"/>
         <w:rPr>
           <w:rFonts w:ascii="Book Antiqua" w:hAnsi="Book Antiqua"/>
-          <w:sz w:val="20"/>
+          <w:sz w:val="18"/>
+          <w:szCs w:val="18"/>
         </w:rPr>
       </w:pPr>
     </w:p>
@@ -2451,20 +2501,23 @@
         <w:jc w:val="both"/>
         <w:rPr>
           <w:rFonts w:ascii="Book Antiqua" w:hAnsi="Book Antiqua"/>
-          <w:sz w:val="20"/>
-        </w:rPr>
-      </w:pPr>
-      <w:r>
-        <w:rPr>
-          <w:rFonts w:ascii="Book Antiqua" w:hAnsi="Book Antiqua"/>
-          <w:sz w:val="20"/>
+          <w:sz w:val="18"/>
+          <w:szCs w:val="18"/>
+        </w:rPr>
+      </w:pPr>
+      <w:r>
+        <w:rPr>
+          <w:rFonts w:ascii="Book Antiqua" w:hAnsi="Book Antiqua"/>
+          <w:sz w:val="18"/>
+          <w:szCs w:val="18"/>
         </w:rPr>
         <w:t>15)</w:t>
       </w:r>
       <w:r>
         <w:rPr>
           <w:rFonts w:ascii="Book Antiqua" w:hAnsi="Book Antiqua"/>
-          <w:sz w:val="20"/>
+          <w:sz w:val="18"/>
+          <w:szCs w:val="18"/>
         </w:rPr>
         <w:t xml:space="preserve"> Pacientes do sexo masculino fizeram exames para diabetes, num hospital, durante um ano, obtendo-se o seguinte resultado:</w:t>
       </w:r>
@@ -2474,19 +2527,21 @@
         <w:pStyle w:val="Ttulo"/>
         <w:rPr>
           <w:rFonts w:ascii="Book Antiqua" w:hAnsi="Book Antiqua"/>
-          <w:sz w:val="20"/>
-        </w:rPr>
-      </w:pPr>
-      <w:r>
-        <w:rPr>
-          <w:rFonts w:ascii="Book Antiqua" w:hAnsi="Book Antiqua"/>
-          <w:sz w:val="20"/>
-        </w:rPr>
-        <w:object w:dxaOrig="5157" w:dyaOrig="1458" w14:anchorId="338F27E6">
-          <v:shape id="_x0000_i1041" type="#_x0000_t75" style="width:258.1pt;height:73.2pt" o:ole="">
+          <w:sz w:val="18"/>
+          <w:szCs w:val="18"/>
+        </w:rPr>
+      </w:pPr>
+      <w:r>
+        <w:rPr>
+          <w:rFonts w:ascii="Book Antiqua" w:hAnsi="Book Antiqua"/>
+          <w:sz w:val="18"/>
+          <w:szCs w:val="18"/>
+        </w:rPr>
+        <w:object w:dxaOrig="5168" w:dyaOrig="1462" w14:anchorId="338F27E6">
+          <v:shape id="_x0000_i1063" type="#_x0000_t75" style="width:258.65pt;height:73.4pt" o:ole="">
             <v:imagedata r:id="rId37" o:title=""/>
           </v:shape>
-          <o:OLEObject Type="Embed" ProgID="Excel.Sheet.12" ShapeID="_x0000_i1041" DrawAspect="Content" ObjectID="_1835725361" r:id="rId38"/>
+          <o:OLEObject Type="Embed" ProgID="Excel.Sheet.12" ShapeID="_x0000_i1063" DrawAspect="Content" ObjectID="_1835931383" r:id="rId38"/>
         </w:object>
       </w:r>
     </w:p>
@@ -2496,13 +2551,15 @@
         <w:jc w:val="both"/>
         <w:rPr>
           <w:rFonts w:ascii="Book Antiqua" w:hAnsi="Book Antiqua"/>
-          <w:sz w:val="20"/>
-        </w:rPr>
-      </w:pPr>
-      <w:r>
-        <w:rPr>
-          <w:rFonts w:ascii="Book Antiqua" w:hAnsi="Book Antiqua"/>
-          <w:sz w:val="20"/>
+          <w:sz w:val="18"/>
+          <w:szCs w:val="18"/>
+        </w:rPr>
+      </w:pPr>
+      <w:r>
+        <w:rPr>
+          <w:rFonts w:ascii="Book Antiqua" w:hAnsi="Book Antiqua"/>
+          <w:sz w:val="18"/>
+          <w:szCs w:val="18"/>
         </w:rPr>
         <w:t>Pergunta-se quantos pacientes:</w:t>
       </w:r>
@@ -2517,27 +2574,31 @@
         <w:jc w:val="both"/>
         <w:rPr>
           <w:rFonts w:ascii="Book Antiqua" w:hAnsi="Book Antiqua"/>
-          <w:sz w:val="20"/>
-        </w:rPr>
-      </w:pPr>
-      <w:r>
-        <w:rPr>
-          <w:rFonts w:ascii="Book Antiqua" w:hAnsi="Book Antiqua"/>
-          <w:sz w:val="20"/>
+          <w:sz w:val="18"/>
+          <w:szCs w:val="18"/>
+        </w:rPr>
+      </w:pPr>
+      <w:r>
+        <w:rPr>
+          <w:rFonts w:ascii="Book Antiqua" w:hAnsi="Book Antiqua"/>
+          <w:sz w:val="18"/>
+          <w:szCs w:val="18"/>
         </w:rPr>
         <w:t xml:space="preserve">Acima de 40 anos têm </w:t>
       </w:r>
       <w:r>
         <w:rPr>
           <w:rFonts w:ascii="Book Antiqua" w:hAnsi="Book Antiqua"/>
-          <w:sz w:val="20"/>
+          <w:sz w:val="18"/>
+          <w:szCs w:val="18"/>
         </w:rPr>
         <w:t xml:space="preserve">pais com </w:t>
       </w:r>
       <w:r>
         <w:rPr>
           <w:rFonts w:ascii="Book Antiqua" w:hAnsi="Book Antiqua"/>
-          <w:sz w:val="20"/>
+          <w:sz w:val="18"/>
+          <w:szCs w:val="18"/>
         </w:rPr>
         <w:t>diabetes?</w:t>
       </w:r>
@@ -2552,13 +2613,15 @@
         <w:jc w:val="both"/>
         <w:rPr>
           <w:rFonts w:ascii="Book Antiqua" w:hAnsi="Book Antiqua"/>
-          <w:sz w:val="20"/>
-        </w:rPr>
-      </w:pPr>
-      <w:r>
-        <w:rPr>
-          <w:rFonts w:ascii="Book Antiqua" w:hAnsi="Book Antiqua"/>
-          <w:sz w:val="20"/>
+          <w:sz w:val="18"/>
+          <w:szCs w:val="18"/>
+        </w:rPr>
+      </w:pPr>
+      <w:r>
+        <w:rPr>
+          <w:rFonts w:ascii="Book Antiqua" w:hAnsi="Book Antiqua"/>
+          <w:sz w:val="18"/>
+          <w:szCs w:val="18"/>
         </w:rPr>
         <w:t>Apresentam caso simples e têm pais não diabéticos</w:t>
       </w:r>
@@ -2573,13 +2636,15 @@
         <w:jc w:val="both"/>
         <w:rPr>
           <w:rFonts w:ascii="Book Antiqua" w:hAnsi="Book Antiqua"/>
-          <w:sz w:val="20"/>
-        </w:rPr>
-      </w:pPr>
-      <w:r>
-        <w:rPr>
-          <w:rFonts w:ascii="Book Antiqua" w:hAnsi="Book Antiqua"/>
-          <w:sz w:val="20"/>
+          <w:sz w:val="18"/>
+          <w:szCs w:val="18"/>
+        </w:rPr>
+      </w:pPr>
+      <w:r>
+        <w:rPr>
+          <w:rFonts w:ascii="Book Antiqua" w:hAnsi="Book Antiqua"/>
+          <w:sz w:val="18"/>
+          <w:szCs w:val="18"/>
         </w:rPr>
         <w:t>Não apresentam um caso grave e não têm abaixo de 40 anos?</w:t>
       </w:r>
@@ -2594,13 +2659,15 @@
         <w:jc w:val="both"/>
         <w:rPr>
           <w:rFonts w:ascii="Book Antiqua" w:hAnsi="Book Antiqua"/>
-          <w:sz w:val="20"/>
-        </w:rPr>
-      </w:pPr>
-      <w:r>
-        <w:rPr>
-          <w:rFonts w:ascii="Book Antiqua" w:hAnsi="Book Antiqua"/>
-          <w:sz w:val="20"/>
+          <w:sz w:val="18"/>
+          <w:szCs w:val="18"/>
+        </w:rPr>
+      </w:pPr>
+      <w:r>
+        <w:rPr>
+          <w:rFonts w:ascii="Book Antiqua" w:hAnsi="Book Antiqua"/>
+          <w:sz w:val="18"/>
+          <w:szCs w:val="18"/>
         </w:rPr>
         <w:t>Não têm um caso grave e têm abaixo de 40 anos e não têm pais diabéticos?</w:t>
       </w:r>
@@ -2611,7 +2678,8 @@
         <w:jc w:val="both"/>
         <w:rPr>
           <w:rFonts w:ascii="Book Antiqua" w:hAnsi="Book Antiqua"/>
-          <w:sz w:val="20"/>
+          <w:sz w:val="18"/>
+          <w:szCs w:val="18"/>
         </w:rPr>
       </w:pPr>
     </w:p>
@@ -2621,20 +2689,23 @@
         <w:jc w:val="both"/>
         <w:rPr>
           <w:rFonts w:ascii="Book Antiqua" w:hAnsi="Book Antiqua"/>
-          <w:sz w:val="20"/>
-        </w:rPr>
-      </w:pPr>
-      <w:r>
-        <w:rPr>
-          <w:rFonts w:ascii="Book Antiqua" w:hAnsi="Book Antiqua"/>
-          <w:sz w:val="20"/>
+          <w:sz w:val="18"/>
+          <w:szCs w:val="18"/>
+        </w:rPr>
+      </w:pPr>
+      <w:r>
+        <w:rPr>
+          <w:rFonts w:ascii="Book Antiqua" w:hAnsi="Book Antiqua"/>
+          <w:sz w:val="18"/>
+          <w:szCs w:val="18"/>
         </w:rPr>
         <w:t>16</w:t>
       </w:r>
       <w:r>
         <w:rPr>
           <w:rFonts w:ascii="Book Antiqua" w:hAnsi="Book Antiqua"/>
-          <w:sz w:val="20"/>
+          <w:sz w:val="18"/>
+          <w:szCs w:val="18"/>
         </w:rPr>
         <w:t>) Depois de n dias de férias, um estudante observa que:</w:t>
       </w:r>
@@ -2645,13 +2716,15 @@
         <w:jc w:val="both"/>
         <w:rPr>
           <w:rFonts w:ascii="Book Antiqua" w:hAnsi="Book Antiqua"/>
-          <w:sz w:val="20"/>
-        </w:rPr>
-      </w:pPr>
-      <w:r>
-        <w:rPr>
-          <w:rFonts w:ascii="Book Antiqua" w:hAnsi="Book Antiqua"/>
-          <w:sz w:val="20"/>
+          <w:sz w:val="18"/>
+          <w:szCs w:val="18"/>
+        </w:rPr>
+      </w:pPr>
+      <w:r>
+        <w:rPr>
+          <w:rFonts w:ascii="Book Antiqua" w:hAnsi="Book Antiqua"/>
+          <w:sz w:val="18"/>
+          <w:szCs w:val="18"/>
         </w:rPr>
         <w:t>1) choveu 7 vezes, de manhã ou à tarde</w:t>
       </w:r>
@@ -2662,13 +2735,15 @@
         <w:jc w:val="both"/>
         <w:rPr>
           <w:rFonts w:ascii="Book Antiqua" w:hAnsi="Book Antiqua"/>
-          <w:sz w:val="20"/>
-        </w:rPr>
-      </w:pPr>
-      <w:r>
-        <w:rPr>
-          <w:rFonts w:ascii="Book Antiqua" w:hAnsi="Book Antiqua"/>
-          <w:sz w:val="20"/>
+          <w:sz w:val="18"/>
+          <w:szCs w:val="18"/>
+        </w:rPr>
+      </w:pPr>
+      <w:r>
+        <w:rPr>
+          <w:rFonts w:ascii="Book Antiqua" w:hAnsi="Book Antiqua"/>
+          <w:sz w:val="18"/>
+          <w:szCs w:val="18"/>
         </w:rPr>
         <w:t>2) quando chove de amanhã, não chove à tarde</w:t>
       </w:r>
@@ -2679,13 +2754,15 @@
         <w:jc w:val="both"/>
         <w:rPr>
           <w:rFonts w:ascii="Book Antiqua" w:hAnsi="Book Antiqua"/>
-          <w:sz w:val="20"/>
-        </w:rPr>
-      </w:pPr>
-      <w:r>
-        <w:rPr>
-          <w:rFonts w:ascii="Book Antiqua" w:hAnsi="Book Antiqua"/>
-          <w:sz w:val="20"/>
+          <w:sz w:val="18"/>
+          <w:szCs w:val="18"/>
+        </w:rPr>
+      </w:pPr>
+      <w:r>
+        <w:rPr>
+          <w:rFonts w:ascii="Book Antiqua" w:hAnsi="Book Antiqua"/>
+          <w:sz w:val="18"/>
+          <w:szCs w:val="18"/>
         </w:rPr>
         <w:t>3) houve 5 tarde sem chuva</w:t>
       </w:r>
@@ -2696,15 +2773,36 @@
         <w:jc w:val="both"/>
         <w:rPr>
           <w:rFonts w:ascii="Book Antiqua" w:hAnsi="Book Antiqua"/>
-          <w:sz w:val="20"/>
-        </w:rPr>
-      </w:pPr>
-      <w:r>
-        <w:rPr>
-          <w:rFonts w:ascii="Book Antiqua" w:hAnsi="Book Antiqua"/>
-          <w:sz w:val="20"/>
+          <w:sz w:val="18"/>
+          <w:szCs w:val="18"/>
+        </w:rPr>
+      </w:pPr>
+      <w:r>
+        <w:rPr>
+          <w:rFonts w:ascii="Book Antiqua" w:hAnsi="Book Antiqua"/>
+          <w:sz w:val="18"/>
+          <w:szCs w:val="18"/>
         </w:rPr>
         <w:t>4) houve 6 manhãs sem chuva</w:t>
+      </w:r>
+    </w:p>
+    <w:p>
+      <w:pPr>
+        <w:pStyle w:val="Ttulo"/>
+        <w:jc w:val="both"/>
+        <w:rPr>
+          <w:rFonts w:ascii="Book Antiqua" w:hAnsi="Book Antiqua"/>
+          <w:sz w:val="18"/>
+          <w:szCs w:val="18"/>
+        </w:rPr>
+      </w:pPr>
+      <w:r>
+        <w:rPr>
+          <w:rFonts w:ascii="Book Antiqua" w:hAnsi="Book Antiqua"/>
+          <w:sz w:val="18"/>
+          <w:szCs w:val="18"/>
+        </w:rPr>
+        <w:t>Então, n é igual a?</w:t>
       </w:r>
     </w:p>
     <w:p>
@@ -2717,31 +2815,6 @@
           <w:szCs w:val="24"/>
         </w:rPr>
       </w:pPr>
-      <w:r>
-        <w:rPr>
-          <w:rFonts w:ascii="Book Antiqua" w:hAnsi="Book Antiqua"/>
-          <w:sz w:val="24"/>
-          <w:szCs w:val="24"/>
-        </w:rPr>
-        <w:t>Então, n é igual a?</w:t>
-      </w:r>
-    </w:p>
-    <w:p>
-      <w:pPr>
-        <w:rPr>
-          <w:rFonts w:ascii="Book Antiqua" w:hAnsi="Book Antiqua"/>
-          <w:sz w:val="24"/>
-          <w:szCs w:val="24"/>
-        </w:rPr>
-      </w:pPr>
-      <w:r>
-        <w:rPr>
-          <w:rFonts w:ascii="Book Antiqua" w:hAnsi="Book Antiqua"/>
-          <w:sz w:val="24"/>
-          <w:szCs w:val="24"/>
-        </w:rPr>
-        <w:br w:type="page"/>
-      </w:r>
     </w:p>
     <w:p>
       <w:pPr>
@@ -2749,17 +2822,6 @@
         <w:jc w:val="both"/>
         <w:rPr>
           <w:rFonts w:ascii="Book Antiqua" w:hAnsi="Book Antiqua"/>
-          <w:sz w:val="24"/>
-          <w:szCs w:val="24"/>
-        </w:rPr>
-      </w:pPr>
-    </w:p>
-    <w:p>
-      <w:pPr>
-        <w:pStyle w:val="Ttulo"/>
-        <w:jc w:val="both"/>
-        <w:rPr>
-          <w:rFonts w:ascii="Book Antiqua" w:hAnsi="Book Antiqua"/>
           <w:sz w:val="20"/>
         </w:rPr>
       </w:pPr>
@@ -2782,7 +2844,23 @@
           <w:rFonts w:ascii="Book Antiqua" w:hAnsi="Book Antiqua"/>
           <w:sz w:val="20"/>
         </w:rPr>
-        <w:t xml:space="preserve"> Dado o Diagrama Venn.</w:t>
+        <w:t xml:space="preserve"> Dado o Diagrama </w:t>
+      </w:r>
+      <w:proofErr w:type="spellStart"/>
+      <w:r>
+        <w:rPr>
+          <w:rFonts w:ascii="Book Antiqua" w:hAnsi="Book Antiqua"/>
+          <w:sz w:val="20"/>
+        </w:rPr>
+        <w:t>Venn</w:t>
+      </w:r>
+      <w:proofErr w:type="spellEnd"/>
+      <w:r>
+        <w:rPr>
+          <w:rFonts w:ascii="Book Antiqua" w:hAnsi="Book Antiqua"/>
+          <w:sz w:val="20"/>
+        </w:rPr>
+        <w:t>.</w:t>
       </w:r>
     </w:p>
     <w:p>
@@ -3846,7 +3924,7 @@
           <v:shape id="_x0000_i1042" type="#_x0000_t75" style="width:103.2pt;height:88pt" o:ole="">
             <v:imagedata r:id="rId39" o:title=""/>
           </v:shape>
-          <o:OLEObject Type="Embed" ProgID="Equation.3" ShapeID="_x0000_i1042" DrawAspect="Content" ObjectID="_1835725362" r:id="rId40"/>
+          <o:OLEObject Type="Embed" ProgID="Equation.3" ShapeID="_x0000_i1042" DrawAspect="Content" ObjectID="_1835931384" r:id="rId40"/>
         </w:object>
       </w:r>
       <w:r>
@@ -3900,7 +3978,7 @@
           <v:shape id="_x0000_i1043" type="#_x0000_t75" style="width:149.15pt;height:88pt" o:ole="">
             <v:imagedata r:id="rId41" o:title=""/>
           </v:shape>
-          <o:OLEObject Type="Embed" ProgID="Equation.3" ShapeID="_x0000_i1043" DrawAspect="Content" ObjectID="_1835725363" r:id="rId42"/>
+          <o:OLEObject Type="Embed" ProgID="Equation.3" ShapeID="_x0000_i1043" DrawAspect="Content" ObjectID="_1835931385" r:id="rId42"/>
         </w:object>
       </w:r>
     </w:p>

</xml_diff>